<commit_message>
Added more page files and linked them all together
</commit_message>
<xml_diff>
--- a/LEARNSPACE LMS FRONTEND.docx
+++ b/LEARNSPACE LMS FRONTEND.docx
@@ -2,7 +2,1524 @@
 <file path=word/document.xml><?xml version="1.0" encoding="utf-8"?>
 <w:document xmlns:wpc="http://schemas.microsoft.com/office/word/2010/wordprocessingCanvas" xmlns:cx="http://schemas.microsoft.com/office/drawing/2014/chartex" xmlns:cx1="http://schemas.microsoft.com/office/drawing/2015/9/8/chartex" xmlns:cx2="http://schemas.microsoft.com/office/drawing/2015/10/21/chartex" xmlns:cx3="http://schemas.microsoft.com/office/drawing/2016/5/9/chartex" xmlns:cx4="http://schemas.microsoft.com/office/drawing/2016/5/10/chartex" xmlns:cx5="http://schemas.microsoft.com/office/drawing/2016/5/11/chartex" xmlns:cx6="http://schemas.microsoft.com/office/drawing/2016/5/12/chartex" xmlns:cx7="http://schemas.microsoft.com/office/drawing/2016/5/13/chartex" xmlns:cx8="http://schemas.microsoft.com/office/drawing/2016/5/14/chartex" xmlns:mc="http://schemas.openxmlformats.org/markup-compatibility/2006" xmlns:aink="http://schemas.microsoft.com/office/drawing/2016/ink" xmlns:am3d="http://schemas.microsoft.com/office/drawing/2017/model3d" xmlns:o="urn:schemas-microsoft-com:office:office" xmlns:oel="http://schemas.microsoft.com/office/2019/extlst" xmlns:r="http://schemas.openxmlformats.org/officeDocument/2006/relationships" xmlns:m="http://schemas.openxmlformats.org/officeDocument/2006/math" xmlns:v="urn:schemas-microsoft-com:vml" xmlns:wp14="http://schemas.microsoft.com/office/word/2010/wordprocessingDrawing" xmlns:wp="http://schemas.openxmlformats.org/drawingml/2006/wordprocessingDrawing" xmlns:w10="urn:schemas-microsoft-com:office:word" xmlns:w="http://schemas.openxmlformats.org/wordprocessingml/2006/main" xmlns:w14="http://schemas.microsoft.com/office/word/2010/wordml" xmlns:w15="http://schemas.microsoft.com/office/word/2012/wordml" xmlns:w16cex="http://schemas.microsoft.com/office/word/2018/wordml/cex" xmlns:w16cid="http://schemas.microsoft.com/office/word/2016/wordml/cid" xmlns:w16="http://schemas.microsoft.com/office/word/2018/wordml" xmlns:w16du="http://schemas.microsoft.com/office/word/2023/wordml/word16du" xmlns:w16sdtdh="http://schemas.microsoft.com/office/word/2020/wordml/sdtdatahash" xmlns:w16sdtfl="http://schemas.microsoft.com/office/word/2024/wordml/sdtformatlock" xmlns:w16se="http://schemas.microsoft.com/office/word/2015/wordml/symex" xmlns:wpg="http://schemas.microsoft.com/office/word/2010/wordprocessingGroup" xmlns:wpi="http://schemas.microsoft.com/office/word/2010/wordprocessingInk" xmlns:wne="http://schemas.microsoft.com/office/word/2006/wordml" xmlns:wps="http://schemas.microsoft.com/office/word/2010/wordprocessingShape" mc:Ignorable="w14 w15 w16se w16cid w16 w16cex w16sdtdh w16sdtfl w16du wp14">
   <w:body>
-    <w:p/>
+    <w:p>
+      <w:pPr>
+        <w:spacing w:line="480" w:lineRule="auto"/>
+        <w:jc w:val="center"/>
+        <w:rPr>
+          <w:rFonts w:ascii="Times New Roman" w:hAnsi="Times New Roman" w:cs="Times New Roman"/>
+        </w:rPr>
+      </w:pPr>
+      <w:r>
+        <w:rPr>
+          <w:rFonts w:ascii="Times New Roman" w:hAnsi="Times New Roman" w:cs="Times New Roman"/>
+        </w:rPr>
+        <w:t xml:space="preserve">LEARNSPACE LMS FRONTEND </w:t>
+      </w:r>
+    </w:p>
+    <w:p>
+      <w:pPr>
+        <w:spacing w:line="480" w:lineRule="auto"/>
+        <w:rPr>
+          <w:rFonts w:ascii="Times New Roman" w:hAnsi="Times New Roman" w:cs="Times New Roman"/>
+        </w:rPr>
+      </w:pPr>
+      <w:r>
+        <w:rPr>
+          <w:rFonts w:ascii="Times New Roman" w:hAnsi="Times New Roman" w:cs="Times New Roman"/>
+        </w:rPr>
+        <w:t>Required Modules:</w:t>
+      </w:r>
+    </w:p>
+    <w:p>
+      <w:pPr>
+        <w:pStyle w:val="ListParagraph"/>
+        <w:numPr>
+          <w:ilvl w:val="0"/>
+          <w:numId w:val="1"/>
+        </w:numPr>
+        <w:spacing w:line="480" w:lineRule="auto"/>
+        <w:rPr>
+          <w:rFonts w:ascii="Times New Roman" w:hAnsi="Times New Roman" w:cs="Times New Roman"/>
+        </w:rPr>
+      </w:pPr>
+      <w:r>
+        <w:rPr>
+          <w:rFonts w:ascii="Times New Roman" w:hAnsi="Times New Roman" w:cs="Times New Roman"/>
+        </w:rPr>
+        <w:t>Landing Page</w:t>
+      </w:r>
+    </w:p>
+    <w:p>
+      <w:pPr>
+        <w:pStyle w:val="ListParagraph"/>
+        <w:numPr>
+          <w:ilvl w:val="0"/>
+          <w:numId w:val="1"/>
+        </w:numPr>
+        <w:spacing w:line="480" w:lineRule="auto"/>
+        <w:rPr>
+          <w:rFonts w:ascii="Times New Roman" w:hAnsi="Times New Roman" w:cs="Times New Roman"/>
+        </w:rPr>
+      </w:pPr>
+      <w:r>
+        <w:rPr>
+          <w:rFonts w:ascii="Times New Roman" w:hAnsi="Times New Roman" w:cs="Times New Roman"/>
+        </w:rPr>
+        <w:t>Login Page</w:t>
+      </w:r>
+    </w:p>
+    <w:p>
+      <w:pPr>
+        <w:pStyle w:val="ListParagraph"/>
+        <w:numPr>
+          <w:ilvl w:val="0"/>
+          <w:numId w:val="1"/>
+        </w:numPr>
+        <w:spacing w:line="480" w:lineRule="auto"/>
+        <w:rPr>
+          <w:rFonts w:ascii="Times New Roman" w:hAnsi="Times New Roman" w:cs="Times New Roman"/>
+        </w:rPr>
+      </w:pPr>
+      <w:r>
+        <w:rPr>
+          <w:rFonts w:ascii="Times New Roman" w:hAnsi="Times New Roman" w:cs="Times New Roman"/>
+        </w:rPr>
+        <w:t>Learner Dashboard</w:t>
+      </w:r>
+    </w:p>
+    <w:p>
+      <w:pPr>
+        <w:pStyle w:val="ListParagraph"/>
+        <w:numPr>
+          <w:ilvl w:val="0"/>
+          <w:numId w:val="1"/>
+        </w:numPr>
+        <w:spacing w:line="480" w:lineRule="auto"/>
+        <w:rPr>
+          <w:rFonts w:ascii="Times New Roman" w:hAnsi="Times New Roman" w:cs="Times New Roman"/>
+        </w:rPr>
+      </w:pPr>
+      <w:r>
+        <w:rPr>
+          <w:rFonts w:ascii="Times New Roman" w:hAnsi="Times New Roman" w:cs="Times New Roman"/>
+        </w:rPr>
+        <w:t>Courses and Modules Page</w:t>
+      </w:r>
+    </w:p>
+    <w:p>
+      <w:pPr>
+        <w:pStyle w:val="ListParagraph"/>
+        <w:numPr>
+          <w:ilvl w:val="0"/>
+          <w:numId w:val="1"/>
+        </w:numPr>
+        <w:spacing w:line="480" w:lineRule="auto"/>
+        <w:rPr>
+          <w:rFonts w:ascii="Times New Roman" w:hAnsi="Times New Roman" w:cs="Times New Roman"/>
+        </w:rPr>
+      </w:pPr>
+      <w:r>
+        <w:rPr>
+          <w:rFonts w:ascii="Times New Roman" w:hAnsi="Times New Roman" w:cs="Times New Roman"/>
+        </w:rPr>
+        <w:t>Lessons Detail Page</w:t>
+      </w:r>
+    </w:p>
+    <w:p>
+      <w:pPr>
+        <w:pStyle w:val="ListParagraph"/>
+        <w:numPr>
+          <w:ilvl w:val="0"/>
+          <w:numId w:val="1"/>
+        </w:numPr>
+        <w:spacing w:line="480" w:lineRule="auto"/>
+        <w:rPr>
+          <w:rFonts w:ascii="Times New Roman" w:hAnsi="Times New Roman" w:cs="Times New Roman"/>
+        </w:rPr>
+      </w:pPr>
+      <w:r>
+        <w:rPr>
+          <w:rFonts w:ascii="Times New Roman" w:hAnsi="Times New Roman" w:cs="Times New Roman"/>
+        </w:rPr>
+        <w:t>Assignment submission Page</w:t>
+      </w:r>
+    </w:p>
+    <w:p>
+      <w:pPr>
+        <w:pStyle w:val="ListParagraph"/>
+        <w:numPr>
+          <w:ilvl w:val="0"/>
+          <w:numId w:val="1"/>
+        </w:numPr>
+        <w:spacing w:line="480" w:lineRule="auto"/>
+        <w:rPr>
+          <w:rFonts w:ascii="Times New Roman" w:hAnsi="Times New Roman" w:cs="Times New Roman"/>
+        </w:rPr>
+      </w:pPr>
+      <w:r>
+        <w:rPr>
+          <w:rFonts w:ascii="Times New Roman" w:hAnsi="Times New Roman" w:cs="Times New Roman"/>
+        </w:rPr>
+        <w:t>Progress or performance page</w:t>
+      </w:r>
+      <w:r>
+        <w:rPr>
+          <w:rFonts w:ascii="Times New Roman" w:hAnsi="Times New Roman" w:cs="Times New Roman"/>
+        </w:rPr>
+        <w:t>)</w:t>
+      </w:r>
+    </w:p>
+    <w:p>
+      <w:pPr>
+        <w:pStyle w:val="ListParagraph"/>
+        <w:numPr>
+          <w:ilvl w:val="0"/>
+          <w:numId w:val="1"/>
+        </w:numPr>
+        <w:spacing w:line="480" w:lineRule="auto"/>
+        <w:rPr>
+          <w:rFonts w:ascii="Times New Roman" w:hAnsi="Times New Roman" w:cs="Times New Roman"/>
+        </w:rPr>
+      </w:pPr>
+      <w:r>
+        <w:rPr>
+          <w:rFonts w:ascii="Times New Roman" w:hAnsi="Times New Roman" w:cs="Times New Roman"/>
+        </w:rPr>
+        <w:t>Profile or settings page</w:t>
+      </w:r>
+    </w:p>
+    <w:p>
+      <w:pPr>
+        <w:spacing w:line="480" w:lineRule="auto"/>
+        <w:rPr>
+          <w:rFonts w:ascii="Times New Roman" w:hAnsi="Times New Roman" w:cs="Times New Roman"/>
+        </w:rPr>
+      </w:pPr>
+      <w:r>
+        <w:rPr>
+          <w:rFonts w:ascii="Times New Roman" w:hAnsi="Times New Roman" w:cs="Times New Roman"/>
+        </w:rPr>
+        <w:t>Potential Colors to Use:</w:t>
+      </w:r>
+    </w:p>
+    <w:p>
+      <w:pPr>
+        <w:pStyle w:val="ListParagraph"/>
+        <w:numPr>
+          <w:ilvl w:val="0"/>
+          <w:numId w:val="2"/>
+        </w:numPr>
+        <w:spacing w:line="480" w:lineRule="auto"/>
+        <w:rPr>
+          <w:rFonts w:ascii="Times New Roman" w:hAnsi="Times New Roman" w:cs="Times New Roman"/>
+        </w:rPr>
+      </w:pPr>
+      <w:r>
+        <w:rPr>
+          <w:rFonts w:ascii="Times New Roman" w:hAnsi="Times New Roman" w:cs="Times New Roman"/>
+        </w:rPr>
+        <w:t xml:space="preserve">Primary </w:t>
+      </w:r>
+      <w:r>
+        <w:rPr>
+          <w:rFonts w:ascii="Times New Roman" w:hAnsi="Times New Roman" w:cs="Times New Roman"/>
+        </w:rPr>
+        <w:t>–</w:t>
+      </w:r>
+      <w:r>
+        <w:rPr>
+          <w:rFonts w:ascii="Times New Roman" w:hAnsi="Times New Roman" w:cs="Times New Roman"/>
+        </w:rPr>
+        <w:t xml:space="preserve"> </w:t>
+      </w:r>
+      <w:r>
+        <w:rPr>
+          <w:rFonts w:ascii="Times New Roman" w:hAnsi="Times New Roman" w:cs="Times New Roman"/>
+        </w:rPr>
+        <w:t>N</w:t>
+      </w:r>
+      <w:r>
+        <w:rPr>
+          <w:rFonts w:ascii="Times New Roman" w:hAnsi="Times New Roman" w:cs="Times New Roman"/>
+        </w:rPr>
+        <w:t>avy or Indigo</w:t>
+      </w:r>
+    </w:p>
+    <w:p>
+      <w:pPr>
+        <w:pStyle w:val="ListParagraph"/>
+        <w:numPr>
+          <w:ilvl w:val="0"/>
+          <w:numId w:val="2"/>
+        </w:numPr>
+        <w:spacing w:line="480" w:lineRule="auto"/>
+        <w:rPr>
+          <w:rFonts w:ascii="Times New Roman" w:hAnsi="Times New Roman" w:cs="Times New Roman"/>
+        </w:rPr>
+      </w:pPr>
+      <w:r>
+        <w:rPr>
+          <w:rFonts w:ascii="Times New Roman" w:hAnsi="Times New Roman" w:cs="Times New Roman"/>
+        </w:rPr>
+        <w:t>Secondary – Green (For progress or completion)</w:t>
+      </w:r>
+    </w:p>
+    <w:p>
+      <w:pPr>
+        <w:pStyle w:val="ListParagraph"/>
+        <w:numPr>
+          <w:ilvl w:val="0"/>
+          <w:numId w:val="2"/>
+        </w:numPr>
+        <w:spacing w:line="480" w:lineRule="auto"/>
+        <w:rPr>
+          <w:rFonts w:ascii="Times New Roman" w:hAnsi="Times New Roman" w:cs="Times New Roman"/>
+        </w:rPr>
+      </w:pPr>
+      <w:r>
+        <w:rPr>
+          <w:rFonts w:ascii="Times New Roman" w:hAnsi="Times New Roman" w:cs="Times New Roman"/>
+        </w:rPr>
+        <w:t>Accent – Warm gray or soft orange (buttons/notification)</w:t>
+      </w:r>
+    </w:p>
+    <w:p>
+      <w:pPr>
+        <w:pStyle w:val="ListParagraph"/>
+        <w:numPr>
+          <w:ilvl w:val="0"/>
+          <w:numId w:val="2"/>
+        </w:numPr>
+        <w:spacing w:line="480" w:lineRule="auto"/>
+        <w:rPr>
+          <w:rFonts w:ascii="Times New Roman" w:hAnsi="Times New Roman" w:cs="Times New Roman"/>
+        </w:rPr>
+      </w:pPr>
+      <w:r>
+        <w:rPr>
+          <w:rFonts w:ascii="Times New Roman" w:hAnsi="Times New Roman" w:cs="Times New Roman"/>
+        </w:rPr>
+        <w:t>Background – Off-white or very light gray</w:t>
+      </w:r>
+    </w:p>
+    <w:p>
+      <w:pPr>
+        <w:spacing w:line="480" w:lineRule="auto"/>
+        <w:rPr>
+          <w:rFonts w:ascii="Times New Roman" w:hAnsi="Times New Roman" w:cs="Times New Roman"/>
+        </w:rPr>
+      </w:pPr>
+      <w:r>
+        <w:rPr>
+          <w:rFonts w:ascii="Times New Roman" w:hAnsi="Times New Roman" w:cs="Times New Roman"/>
+        </w:rPr>
+        <w:t>User Flow (End-to-End):</w:t>
+      </w:r>
+    </w:p>
+    <w:p>
+      <w:pPr>
+        <w:spacing w:line="480" w:lineRule="auto"/>
+        <w:rPr>
+          <w:rFonts w:ascii="Times New Roman" w:hAnsi="Times New Roman" w:cs="Times New Roman"/>
+        </w:rPr>
+      </w:pPr>
+      <w:r>
+        <w:rPr>
+          <w:rFonts w:ascii="Times New Roman" w:hAnsi="Times New Roman" w:cs="Times New Roman"/>
+        </w:rPr>
+        <w:t>Login – Dashboard - Course View – Lesson Details – Assignment – Progress - Profile</w:t>
+      </w:r>
+      <w:r>
+        <w:rPr>
+          <w:rFonts w:ascii="Times New Roman" w:hAnsi="Times New Roman" w:cs="Times New Roman"/>
+        </w:rPr>
+        <w:br/>
+      </w:r>
+    </w:p>
+    <w:p>
+      <w:pPr>
+        <w:spacing w:line="480" w:lineRule="auto"/>
+        <w:rPr>
+          <w:rFonts w:ascii="Times New Roman" w:hAnsi="Times New Roman" w:cs="Times New Roman"/>
+        </w:rPr>
+      </w:pPr>
+      <w:r>
+        <w:rPr>
+          <w:rFonts w:ascii="Times New Roman" w:hAnsi="Times New Roman" w:cs="Times New Roman"/>
+        </w:rPr>
+        <w:t xml:space="preserve">Here’s a clear user flow for your </w:t>
+      </w:r>
+      <w:proofErr w:type="spellStart"/>
+      <w:r>
+        <w:rPr>
+          <w:rFonts w:ascii="Times New Roman" w:hAnsi="Times New Roman" w:cs="Times New Roman"/>
+        </w:rPr>
+        <w:t>LearnSpace</w:t>
+      </w:r>
+      <w:proofErr w:type="spellEnd"/>
+      <w:r>
+        <w:rPr>
+          <w:rFonts w:ascii="Times New Roman" w:hAnsi="Times New Roman" w:cs="Times New Roman"/>
+        </w:rPr>
+        <w:t xml:space="preserve"> LMS frontend MVP, with page-by-page component suggestions.</w:t>
+      </w:r>
+    </w:p>
+    <w:p>
+      <w:pPr>
+        <w:spacing w:line="480" w:lineRule="auto"/>
+        <w:rPr>
+          <w:rFonts w:ascii="Times New Roman" w:hAnsi="Times New Roman" w:cs="Times New Roman"/>
+        </w:rPr>
+      </w:pPr>
+    </w:p>
+    <w:p>
+      <w:pPr>
+        <w:spacing w:line="480" w:lineRule="auto"/>
+        <w:rPr>
+          <w:rFonts w:ascii="Times New Roman" w:hAnsi="Times New Roman" w:cs="Times New Roman"/>
+        </w:rPr>
+      </w:pPr>
+      <w:r>
+        <w:rPr>
+          <w:rFonts w:ascii="Times New Roman" w:hAnsi="Times New Roman" w:cs="Times New Roman"/>
+        </w:rPr>
+        <w:lastRenderedPageBreak/>
+        <w:t>---</w:t>
+      </w:r>
+    </w:p>
+    <w:p>
+      <w:pPr>
+        <w:spacing w:line="480" w:lineRule="auto"/>
+        <w:rPr>
+          <w:rFonts w:ascii="Times New Roman" w:hAnsi="Times New Roman" w:cs="Times New Roman"/>
+        </w:rPr>
+      </w:pPr>
+    </w:p>
+    <w:p>
+      <w:pPr>
+        <w:spacing w:line="480" w:lineRule="auto"/>
+        <w:rPr>
+          <w:rFonts w:ascii="Times New Roman" w:hAnsi="Times New Roman" w:cs="Times New Roman"/>
+        </w:rPr>
+      </w:pPr>
+      <w:r>
+        <w:rPr>
+          <w:rFonts w:ascii="Times New Roman" w:hAnsi="Times New Roman" w:cs="Times New Roman"/>
+        </w:rPr>
+        <w:t>USER FLOW (End-to-End)</w:t>
+      </w:r>
+    </w:p>
+    <w:p>
+      <w:pPr>
+        <w:spacing w:line="480" w:lineRule="auto"/>
+        <w:rPr>
+          <w:rFonts w:ascii="Times New Roman" w:hAnsi="Times New Roman" w:cs="Times New Roman"/>
+        </w:rPr>
+      </w:pPr>
+    </w:p>
+    <w:p>
+      <w:pPr>
+        <w:spacing w:line="480" w:lineRule="auto"/>
+        <w:rPr>
+          <w:rFonts w:ascii="Times New Roman" w:hAnsi="Times New Roman" w:cs="Times New Roman"/>
+        </w:rPr>
+      </w:pPr>
+      <w:r>
+        <w:rPr>
+          <w:rFonts w:ascii="Times New Roman" w:hAnsi="Times New Roman" w:cs="Times New Roman"/>
+        </w:rPr>
+        <w:t>```</w:t>
+      </w:r>
+    </w:p>
+    <w:p>
+      <w:pPr>
+        <w:spacing w:line="480" w:lineRule="auto"/>
+        <w:rPr>
+          <w:rFonts w:ascii="Times New Roman" w:hAnsi="Times New Roman" w:cs="Times New Roman"/>
+        </w:rPr>
+      </w:pPr>
+      <w:r>
+        <w:rPr>
+          <w:rFonts w:ascii="Times New Roman" w:hAnsi="Times New Roman" w:cs="Times New Roman"/>
+        </w:rPr>
+        <w:t>Login → Dashboard → Course View → Lesson Detail → Assignment → Progress → Profile</w:t>
+      </w:r>
+    </w:p>
+    <w:p>
+      <w:pPr>
+        <w:spacing w:line="480" w:lineRule="auto"/>
+        <w:rPr>
+          <w:rFonts w:ascii="Times New Roman" w:hAnsi="Times New Roman" w:cs="Times New Roman"/>
+        </w:rPr>
+      </w:pPr>
+      <w:r>
+        <w:rPr>
+          <w:rFonts w:ascii="Times New Roman" w:hAnsi="Times New Roman" w:cs="Times New Roman"/>
+        </w:rPr>
+        <w:t>```</w:t>
+      </w:r>
+    </w:p>
+    <w:p>
+      <w:pPr>
+        <w:spacing w:line="480" w:lineRule="auto"/>
+        <w:rPr>
+          <w:rFonts w:ascii="Times New Roman" w:hAnsi="Times New Roman" w:cs="Times New Roman"/>
+        </w:rPr>
+      </w:pPr>
+    </w:p>
+    <w:p>
+      <w:pPr>
+        <w:spacing w:line="480" w:lineRule="auto"/>
+        <w:rPr>
+          <w:rFonts w:ascii="Times New Roman" w:hAnsi="Times New Roman" w:cs="Times New Roman"/>
+        </w:rPr>
+      </w:pPr>
+      <w:r>
+        <w:rPr>
+          <w:rFonts w:ascii="Times New Roman" w:hAnsi="Times New Roman" w:cs="Times New Roman"/>
+        </w:rPr>
+        <w:t>---</w:t>
+      </w:r>
+    </w:p>
+    <w:p>
+      <w:pPr>
+        <w:spacing w:line="480" w:lineRule="auto"/>
+        <w:rPr>
+          <w:rFonts w:ascii="Times New Roman" w:hAnsi="Times New Roman" w:cs="Times New Roman"/>
+        </w:rPr>
+      </w:pPr>
+    </w:p>
+    <w:p>
+      <w:pPr>
+        <w:spacing w:line="480" w:lineRule="auto"/>
+        <w:rPr>
+          <w:rFonts w:ascii="Times New Roman" w:hAnsi="Times New Roman" w:cs="Times New Roman"/>
+        </w:rPr>
+      </w:pPr>
+      <w:r>
+        <w:rPr>
+          <w:rFonts w:ascii="Times New Roman" w:hAnsi="Times New Roman" w:cs="Times New Roman"/>
+        </w:rPr>
+        <w:t>PAGE-BY-PAGE BREAKDOWN</w:t>
+      </w:r>
+    </w:p>
+    <w:p>
+      <w:pPr>
+        <w:spacing w:line="480" w:lineRule="auto"/>
+        <w:rPr>
+          <w:rFonts w:ascii="Times New Roman" w:hAnsi="Times New Roman" w:cs="Times New Roman"/>
+        </w:rPr>
+      </w:pPr>
+      <w:r>
+        <w:rPr>
+          <w:rFonts w:ascii="Times New Roman" w:hAnsi="Times New Roman" w:cs="Times New Roman"/>
+        </w:rPr>
+        <w:t>1. Landing Page (Public)</w:t>
+      </w:r>
+    </w:p>
+    <w:p>
+      <w:pPr>
+        <w:spacing w:line="480" w:lineRule="auto"/>
+        <w:rPr>
+          <w:rFonts w:ascii="Times New Roman" w:hAnsi="Times New Roman" w:cs="Times New Roman"/>
+        </w:rPr>
+      </w:pPr>
+      <w:r>
+        <w:rPr>
+          <w:rFonts w:ascii="Times New Roman" w:hAnsi="Times New Roman" w:cs="Times New Roman"/>
+        </w:rPr>
+        <w:t>Goal: Explain value, call to action → Login</w:t>
+      </w:r>
+    </w:p>
+    <w:p>
+      <w:pPr>
+        <w:spacing w:line="480" w:lineRule="auto"/>
+        <w:rPr>
+          <w:rFonts w:ascii="Times New Roman" w:hAnsi="Times New Roman" w:cs="Times New Roman"/>
+        </w:rPr>
+      </w:pPr>
+      <w:r>
+        <w:rPr>
+          <w:rFonts w:ascii="Times New Roman" w:hAnsi="Times New Roman" w:cs="Times New Roman"/>
+        </w:rPr>
+        <w:t>Components:</w:t>
+      </w:r>
+    </w:p>
+    <w:p>
+      <w:pPr>
+        <w:spacing w:line="480" w:lineRule="auto"/>
+        <w:rPr>
+          <w:rFonts w:ascii="Times New Roman" w:hAnsi="Times New Roman" w:cs="Times New Roman"/>
+        </w:rPr>
+      </w:pPr>
+      <w:r>
+        <w:rPr>
+          <w:rFonts w:ascii="Times New Roman" w:hAnsi="Times New Roman" w:cs="Times New Roman"/>
+        </w:rPr>
+        <w:t>· Hero section (title + subtitle + CTA button)</w:t>
+      </w:r>
+    </w:p>
+    <w:p>
+      <w:pPr>
+        <w:spacing w:line="480" w:lineRule="auto"/>
+        <w:rPr>
+          <w:rFonts w:ascii="Times New Roman" w:hAnsi="Times New Roman" w:cs="Times New Roman"/>
+        </w:rPr>
+      </w:pPr>
+      <w:r>
+        <w:rPr>
+          <w:rFonts w:ascii="Times New Roman" w:hAnsi="Times New Roman" w:cs="Times New Roman"/>
+        </w:rPr>
+        <w:t>· Features grid (3–4 cards: track progress, submit assignments, etc.)</w:t>
+      </w:r>
+    </w:p>
+    <w:p>
+      <w:pPr>
+        <w:spacing w:line="480" w:lineRule="auto"/>
+        <w:rPr>
+          <w:rFonts w:ascii="Times New Roman" w:hAnsi="Times New Roman" w:cs="Times New Roman"/>
+        </w:rPr>
+      </w:pPr>
+      <w:r>
+        <w:rPr>
+          <w:rFonts w:ascii="Times New Roman" w:hAnsi="Times New Roman" w:cs="Times New Roman"/>
+        </w:rPr>
+        <w:t>· Mock course preview cards (optional)</w:t>
+      </w:r>
+    </w:p>
+    <w:p>
+      <w:pPr>
+        <w:spacing w:line="480" w:lineRule="auto"/>
+        <w:rPr>
+          <w:rFonts w:ascii="Times New Roman" w:hAnsi="Times New Roman" w:cs="Times New Roman"/>
+        </w:rPr>
+      </w:pPr>
+      <w:r>
+        <w:rPr>
+          <w:rFonts w:ascii="Times New Roman" w:hAnsi="Times New Roman" w:cs="Times New Roman"/>
+        </w:rPr>
+        <w:t>· Footer (links, copyright)</w:t>
+      </w:r>
+    </w:p>
+    <w:p>
+      <w:pPr>
+        <w:spacing w:line="480" w:lineRule="auto"/>
+        <w:rPr>
+          <w:rFonts w:ascii="Times New Roman" w:hAnsi="Times New Roman" w:cs="Times New Roman"/>
+        </w:rPr>
+      </w:pPr>
+      <w:r>
+        <w:rPr>
+          <w:rFonts w:ascii="Times New Roman" w:hAnsi="Times New Roman" w:cs="Times New Roman"/>
+        </w:rPr>
+        <w:lastRenderedPageBreak/>
+        <w:t>2. Login Page</w:t>
+      </w:r>
+    </w:p>
+    <w:p>
+      <w:pPr>
+        <w:spacing w:line="480" w:lineRule="auto"/>
+        <w:rPr>
+          <w:rFonts w:ascii="Times New Roman" w:hAnsi="Times New Roman" w:cs="Times New Roman"/>
+        </w:rPr>
+      </w:pPr>
+      <w:r>
+        <w:rPr>
+          <w:rFonts w:ascii="Times New Roman" w:hAnsi="Times New Roman" w:cs="Times New Roman"/>
+        </w:rPr>
+        <w:t>Goal: Authenticate learner (mock auth is fine for MVP)</w:t>
+      </w:r>
+    </w:p>
+    <w:p>
+      <w:pPr>
+        <w:spacing w:line="480" w:lineRule="auto"/>
+        <w:rPr>
+          <w:rFonts w:ascii="Times New Roman" w:hAnsi="Times New Roman" w:cs="Times New Roman"/>
+        </w:rPr>
+      </w:pPr>
+      <w:r>
+        <w:rPr>
+          <w:rFonts w:ascii="Times New Roman" w:hAnsi="Times New Roman" w:cs="Times New Roman"/>
+        </w:rPr>
+        <w:t>Components:</w:t>
+      </w:r>
+    </w:p>
+    <w:p>
+      <w:pPr>
+        <w:spacing w:line="480" w:lineRule="auto"/>
+        <w:rPr>
+          <w:rFonts w:ascii="Times New Roman" w:hAnsi="Times New Roman" w:cs="Times New Roman"/>
+        </w:rPr>
+      </w:pPr>
+      <w:r>
+        <w:rPr>
+          <w:rFonts w:ascii="Times New Roman" w:hAnsi="Times New Roman" w:cs="Times New Roman"/>
+        </w:rPr>
+        <w:t>· Email + Password fields</w:t>
+      </w:r>
+    </w:p>
+    <w:p>
+      <w:pPr>
+        <w:spacing w:line="480" w:lineRule="auto"/>
+        <w:rPr>
+          <w:rFonts w:ascii="Times New Roman" w:hAnsi="Times New Roman" w:cs="Times New Roman"/>
+        </w:rPr>
+      </w:pPr>
+      <w:r>
+        <w:rPr>
+          <w:rFonts w:ascii="Times New Roman" w:hAnsi="Times New Roman" w:cs="Times New Roman"/>
+        </w:rPr>
+        <w:t>· "Remember me" checkbox</w:t>
+      </w:r>
+    </w:p>
+    <w:p>
+      <w:pPr>
+        <w:spacing w:line="480" w:lineRule="auto"/>
+        <w:rPr>
+          <w:rFonts w:ascii="Times New Roman" w:hAnsi="Times New Roman" w:cs="Times New Roman"/>
+        </w:rPr>
+      </w:pPr>
+      <w:r>
+        <w:rPr>
+          <w:rFonts w:ascii="Times New Roman" w:hAnsi="Times New Roman" w:cs="Times New Roman"/>
+        </w:rPr>
+        <w:t>· Login button (demo: hardcode a test user or mock token)</w:t>
+      </w:r>
+    </w:p>
+    <w:p>
+      <w:pPr>
+        <w:spacing w:line="480" w:lineRule="auto"/>
+        <w:rPr>
+          <w:rFonts w:ascii="Times New Roman" w:hAnsi="Times New Roman" w:cs="Times New Roman"/>
+        </w:rPr>
+      </w:pPr>
+      <w:r>
+        <w:rPr>
+          <w:rFonts w:ascii="Times New Roman" w:hAnsi="Times New Roman" w:cs="Times New Roman"/>
+        </w:rPr>
+        <w:t>· Link to "Demo access" (optional, for reviewers)</w:t>
+      </w:r>
+    </w:p>
+    <w:p>
+      <w:pPr>
+        <w:spacing w:line="480" w:lineRule="auto"/>
+        <w:rPr>
+          <w:rFonts w:ascii="Times New Roman" w:hAnsi="Times New Roman" w:cs="Times New Roman"/>
+        </w:rPr>
+      </w:pPr>
+      <w:r>
+        <w:rPr>
+          <w:rFonts w:ascii="Times New Roman" w:hAnsi="Times New Roman" w:cs="Times New Roman"/>
+        </w:rPr>
+        <w:t>3. Learner Dashboard (Home after login)</w:t>
+      </w:r>
+    </w:p>
+    <w:p>
+      <w:pPr>
+        <w:spacing w:line="480" w:lineRule="auto"/>
+        <w:rPr>
+          <w:rFonts w:ascii="Times New Roman" w:hAnsi="Times New Roman" w:cs="Times New Roman"/>
+        </w:rPr>
+      </w:pPr>
+      <w:r>
+        <w:rPr>
+          <w:rFonts w:ascii="Times New Roman" w:hAnsi="Times New Roman" w:cs="Times New Roman"/>
+        </w:rPr>
+        <w:t>Goal: Overview of enrolled courses + progress summary</w:t>
+      </w:r>
+    </w:p>
+    <w:p>
+      <w:pPr>
+        <w:spacing w:line="480" w:lineRule="auto"/>
+        <w:rPr>
+          <w:rFonts w:ascii="Times New Roman" w:hAnsi="Times New Roman" w:cs="Times New Roman"/>
+        </w:rPr>
+      </w:pPr>
+      <w:r>
+        <w:rPr>
+          <w:rFonts w:ascii="Times New Roman" w:hAnsi="Times New Roman" w:cs="Times New Roman"/>
+        </w:rPr>
+        <w:t>Components:</w:t>
+      </w:r>
+    </w:p>
+    <w:p>
+      <w:pPr>
+        <w:spacing w:line="480" w:lineRule="auto"/>
+        <w:rPr>
+          <w:rFonts w:ascii="Times New Roman" w:hAnsi="Times New Roman" w:cs="Times New Roman"/>
+        </w:rPr>
+      </w:pPr>
+      <w:r>
+        <w:rPr>
+          <w:rFonts w:ascii="Times New Roman" w:hAnsi="Times New Roman" w:cs="Times New Roman"/>
+        </w:rPr>
+        <w:t>· Sidebar (navigation: Dashboard, Courses, Progress, Profile)</w:t>
+      </w:r>
+    </w:p>
+    <w:p>
+      <w:pPr>
+        <w:spacing w:line="480" w:lineRule="auto"/>
+        <w:rPr>
+          <w:rFonts w:ascii="Times New Roman" w:hAnsi="Times New Roman" w:cs="Times New Roman"/>
+        </w:rPr>
+      </w:pPr>
+      <w:r>
+        <w:rPr>
+          <w:rFonts w:ascii="Times New Roman" w:hAnsi="Times New Roman" w:cs="Times New Roman"/>
+        </w:rPr>
+        <w:t>· Header (avatar + name)</w:t>
+      </w:r>
+    </w:p>
+    <w:p>
+      <w:pPr>
+        <w:spacing w:line="480" w:lineRule="auto"/>
+        <w:rPr>
+          <w:rFonts w:ascii="Times New Roman" w:hAnsi="Times New Roman" w:cs="Times New Roman"/>
+        </w:rPr>
+      </w:pPr>
+      <w:r>
+        <w:rPr>
+          <w:rFonts w:ascii="Times New Roman" w:hAnsi="Times New Roman" w:cs="Times New Roman"/>
+        </w:rPr>
+        <w:t>· Welcome section ("Welcome back, [Name]")</w:t>
+      </w:r>
+    </w:p>
+    <w:p>
+      <w:pPr>
+        <w:spacing w:line="480" w:lineRule="auto"/>
+        <w:rPr>
+          <w:rFonts w:ascii="Times New Roman" w:hAnsi="Times New Roman" w:cs="Times New Roman"/>
+        </w:rPr>
+      </w:pPr>
+      <w:r>
+        <w:rPr>
+          <w:rFonts w:ascii="Times New Roman" w:hAnsi="Times New Roman" w:cs="Times New Roman"/>
+        </w:rPr>
+        <w:t>· Enrolled courses grid (course cards with image, title, progress %)</w:t>
+      </w:r>
+    </w:p>
+    <w:p>
+      <w:pPr>
+        <w:spacing w:line="480" w:lineRule="auto"/>
+        <w:rPr>
+          <w:rFonts w:ascii="Times New Roman" w:hAnsi="Times New Roman" w:cs="Times New Roman"/>
+        </w:rPr>
+      </w:pPr>
+      <w:r>
+        <w:rPr>
+          <w:rFonts w:ascii="Times New Roman" w:hAnsi="Times New Roman" w:cs="Times New Roman"/>
+        </w:rPr>
+        <w:t>· Recent activity (last lesson accessed, pending assignment)</w:t>
+      </w:r>
+    </w:p>
+    <w:p>
+      <w:pPr>
+        <w:spacing w:line="480" w:lineRule="auto"/>
+        <w:rPr>
+          <w:rFonts w:ascii="Times New Roman" w:hAnsi="Times New Roman" w:cs="Times New Roman"/>
+        </w:rPr>
+      </w:pPr>
+      <w:r>
+        <w:rPr>
+          <w:rFonts w:ascii="Times New Roman" w:hAnsi="Times New Roman" w:cs="Times New Roman"/>
+        </w:rPr>
+        <w:t>· Overall progress ring or bar (optional)</w:t>
+      </w:r>
+    </w:p>
+    <w:p>
+      <w:pPr>
+        <w:spacing w:line="480" w:lineRule="auto"/>
+        <w:rPr>
+          <w:rFonts w:ascii="Times New Roman" w:hAnsi="Times New Roman" w:cs="Times New Roman"/>
+        </w:rPr>
+      </w:pPr>
+    </w:p>
+    <w:p>
+      <w:pPr>
+        <w:spacing w:line="480" w:lineRule="auto"/>
+        <w:rPr>
+          <w:rFonts w:ascii="Times New Roman" w:hAnsi="Times New Roman" w:cs="Times New Roman"/>
+        </w:rPr>
+      </w:pPr>
+    </w:p>
+    <w:p>
+      <w:pPr>
+        <w:spacing w:line="480" w:lineRule="auto"/>
+        <w:rPr>
+          <w:rFonts w:ascii="Times New Roman" w:hAnsi="Times New Roman" w:cs="Times New Roman"/>
+        </w:rPr>
+      </w:pPr>
+      <w:r>
+        <w:rPr>
+          <w:rFonts w:ascii="Times New Roman" w:hAnsi="Times New Roman" w:cs="Times New Roman"/>
+        </w:rPr>
+        <w:lastRenderedPageBreak/>
+        <w:t>4. Courses &amp; Mo</w:t>
+      </w:r>
+      <w:r>
+        <w:rPr>
+          <w:rFonts w:ascii="Times New Roman" w:hAnsi="Times New Roman" w:cs="Times New Roman"/>
+        </w:rPr>
+        <w:t>d</w:t>
+      </w:r>
+      <w:r>
+        <w:rPr>
+          <w:rFonts w:ascii="Times New Roman" w:hAnsi="Times New Roman" w:cs="Times New Roman"/>
+        </w:rPr>
+        <w:t>ules Page</w:t>
+      </w:r>
+    </w:p>
+    <w:p>
+      <w:pPr>
+        <w:spacing w:line="480" w:lineRule="auto"/>
+        <w:rPr>
+          <w:rFonts w:ascii="Times New Roman" w:hAnsi="Times New Roman" w:cs="Times New Roman"/>
+        </w:rPr>
+      </w:pPr>
+      <w:r>
+        <w:rPr>
+          <w:rFonts w:ascii="Times New Roman" w:hAnsi="Times New Roman" w:cs="Times New Roman"/>
+        </w:rPr>
+        <w:t>Goal: See all enrolled courses + expand modules</w:t>
+      </w:r>
+    </w:p>
+    <w:p>
+      <w:pPr>
+        <w:spacing w:line="480" w:lineRule="auto"/>
+        <w:rPr>
+          <w:rFonts w:ascii="Times New Roman" w:hAnsi="Times New Roman" w:cs="Times New Roman"/>
+        </w:rPr>
+      </w:pPr>
+      <w:r>
+        <w:rPr>
+          <w:rFonts w:ascii="Times New Roman" w:hAnsi="Times New Roman" w:cs="Times New Roman"/>
+        </w:rPr>
+        <w:t>Components:</w:t>
+      </w:r>
+    </w:p>
+    <w:p>
+      <w:pPr>
+        <w:spacing w:line="480" w:lineRule="auto"/>
+        <w:rPr>
+          <w:rFonts w:ascii="Times New Roman" w:hAnsi="Times New Roman" w:cs="Times New Roman"/>
+        </w:rPr>
+      </w:pPr>
+      <w:r>
+        <w:rPr>
+          <w:rFonts w:ascii="Times New Roman" w:hAnsi="Times New Roman" w:cs="Times New Roman"/>
+        </w:rPr>
+        <w:t>· Course selector (tabs or cards)</w:t>
+      </w:r>
+    </w:p>
+    <w:p>
+      <w:pPr>
+        <w:spacing w:line="480" w:lineRule="auto"/>
+        <w:rPr>
+          <w:rFonts w:ascii="Times New Roman" w:hAnsi="Times New Roman" w:cs="Times New Roman"/>
+        </w:rPr>
+      </w:pPr>
+      <w:r>
+        <w:rPr>
+          <w:rFonts w:ascii="Times New Roman" w:hAnsi="Times New Roman" w:cs="Times New Roman"/>
+        </w:rPr>
+        <w:t>· Module accordion/list for selected course:</w:t>
+      </w:r>
+    </w:p>
+    <w:p>
+      <w:pPr>
+        <w:spacing w:line="480" w:lineRule="auto"/>
+        <w:rPr>
+          <w:rFonts w:ascii="Times New Roman" w:hAnsi="Times New Roman" w:cs="Times New Roman"/>
+        </w:rPr>
+      </w:pPr>
+      <w:r>
+        <w:rPr>
+          <w:rFonts w:ascii="Times New Roman" w:hAnsi="Times New Roman" w:cs="Times New Roman"/>
+        </w:rPr>
+        <w:t xml:space="preserve">  · Lesson title</w:t>
+      </w:r>
+    </w:p>
+    <w:p>
+      <w:pPr>
+        <w:spacing w:line="480" w:lineRule="auto"/>
+        <w:rPr>
+          <w:rFonts w:ascii="Times New Roman" w:hAnsi="Times New Roman" w:cs="Times New Roman"/>
+        </w:rPr>
+      </w:pPr>
+      <w:r>
+        <w:rPr>
+          <w:rFonts w:ascii="Times New Roman" w:hAnsi="Times New Roman" w:cs="Times New Roman"/>
+        </w:rPr>
+        <w:t xml:space="preserve">  · Completion status (checkbox or dot)</w:t>
+      </w:r>
+    </w:p>
+    <w:p>
+      <w:pPr>
+        <w:spacing w:line="480" w:lineRule="auto"/>
+        <w:rPr>
+          <w:rFonts w:ascii="Times New Roman" w:hAnsi="Times New Roman" w:cs="Times New Roman"/>
+        </w:rPr>
+      </w:pPr>
+      <w:r>
+        <w:rPr>
+          <w:rFonts w:ascii="Times New Roman" w:hAnsi="Times New Roman" w:cs="Times New Roman"/>
+        </w:rPr>
+        <w:t xml:space="preserve">  · Lock/unlock based on prerequisites (optional)</w:t>
+      </w:r>
+    </w:p>
+    <w:p>
+      <w:pPr>
+        <w:spacing w:line="480" w:lineRule="auto"/>
+        <w:rPr>
+          <w:rFonts w:ascii="Times New Roman" w:hAnsi="Times New Roman" w:cs="Times New Roman"/>
+        </w:rPr>
+      </w:pPr>
+      <w:r>
+        <w:rPr>
+          <w:rFonts w:ascii="Times New Roman" w:hAnsi="Times New Roman" w:cs="Times New Roman"/>
+        </w:rPr>
+        <w:t>· Progress bar per course</w:t>
+      </w:r>
+    </w:p>
+    <w:p>
+      <w:pPr>
+        <w:spacing w:line="480" w:lineRule="auto"/>
+        <w:rPr>
+          <w:rFonts w:ascii="Times New Roman" w:hAnsi="Times New Roman" w:cs="Times New Roman"/>
+        </w:rPr>
+      </w:pPr>
+      <w:r>
+        <w:rPr>
+          <w:rFonts w:ascii="Times New Roman" w:hAnsi="Times New Roman" w:cs="Times New Roman"/>
+        </w:rPr>
+        <w:t>5. Lesson Detail Page</w:t>
+      </w:r>
+    </w:p>
+    <w:p>
+      <w:pPr>
+        <w:spacing w:line="480" w:lineRule="auto"/>
+        <w:rPr>
+          <w:rFonts w:ascii="Times New Roman" w:hAnsi="Times New Roman" w:cs="Times New Roman"/>
+        </w:rPr>
+      </w:pPr>
+      <w:r>
+        <w:rPr>
+          <w:rFonts w:ascii="Times New Roman" w:hAnsi="Times New Roman" w:cs="Times New Roman"/>
+        </w:rPr>
+        <w:t>Goal: View lesson content + mark complete</w:t>
+      </w:r>
+    </w:p>
+    <w:p>
+      <w:pPr>
+        <w:spacing w:line="480" w:lineRule="auto"/>
+        <w:rPr>
+          <w:rFonts w:ascii="Times New Roman" w:hAnsi="Times New Roman" w:cs="Times New Roman"/>
+        </w:rPr>
+      </w:pPr>
+      <w:r>
+        <w:rPr>
+          <w:rFonts w:ascii="Times New Roman" w:hAnsi="Times New Roman" w:cs="Times New Roman"/>
+        </w:rPr>
+        <w:t>Components:</w:t>
+      </w:r>
+    </w:p>
+    <w:p>
+      <w:pPr>
+        <w:spacing w:line="480" w:lineRule="auto"/>
+        <w:rPr>
+          <w:rFonts w:ascii="Times New Roman" w:hAnsi="Times New Roman" w:cs="Times New Roman"/>
+        </w:rPr>
+      </w:pPr>
+      <w:r>
+        <w:rPr>
+          <w:rFonts w:ascii="Times New Roman" w:hAnsi="Times New Roman" w:cs="Times New Roman"/>
+        </w:rPr>
+        <w:t>· Lesson title + description</w:t>
+      </w:r>
+    </w:p>
+    <w:p>
+      <w:pPr>
+        <w:spacing w:line="480" w:lineRule="auto"/>
+        <w:rPr>
+          <w:rFonts w:ascii="Times New Roman" w:hAnsi="Times New Roman" w:cs="Times New Roman"/>
+        </w:rPr>
+      </w:pPr>
+      <w:r>
+        <w:rPr>
+          <w:rFonts w:ascii="Times New Roman" w:hAnsi="Times New Roman" w:cs="Times New Roman"/>
+        </w:rPr>
+        <w:t>· Content area (text, video embed placeholder, or markdown)</w:t>
+      </w:r>
+    </w:p>
+    <w:p>
+      <w:pPr>
+        <w:spacing w:line="480" w:lineRule="auto"/>
+        <w:rPr>
+          <w:rFonts w:ascii="Times New Roman" w:hAnsi="Times New Roman" w:cs="Times New Roman"/>
+        </w:rPr>
+      </w:pPr>
+      <w:r>
+        <w:rPr>
+          <w:rFonts w:ascii="Times New Roman" w:hAnsi="Times New Roman" w:cs="Times New Roman"/>
+        </w:rPr>
+        <w:t>· "Mark as Complete" button (updates progress)</w:t>
+      </w:r>
+    </w:p>
+    <w:p>
+      <w:pPr>
+        <w:spacing w:line="480" w:lineRule="auto"/>
+        <w:rPr>
+          <w:rFonts w:ascii="Times New Roman" w:hAnsi="Times New Roman" w:cs="Times New Roman"/>
+        </w:rPr>
+      </w:pPr>
+      <w:r>
+        <w:rPr>
+          <w:rFonts w:ascii="Times New Roman" w:hAnsi="Times New Roman" w:cs="Times New Roman"/>
+        </w:rPr>
+        <w:t>· Previous/Next lesson buttons</w:t>
+      </w:r>
+    </w:p>
+    <w:p>
+      <w:pPr>
+        <w:spacing w:line="480" w:lineRule="auto"/>
+        <w:rPr>
+          <w:rFonts w:ascii="Times New Roman" w:hAnsi="Times New Roman" w:cs="Times New Roman"/>
+        </w:rPr>
+      </w:pPr>
+      <w:r>
+        <w:rPr>
+          <w:rFonts w:ascii="Times New Roman" w:hAnsi="Times New Roman" w:cs="Times New Roman"/>
+        </w:rPr>
+        <w:t>· Back to course link</w:t>
+      </w:r>
+    </w:p>
+    <w:p>
+      <w:pPr>
+        <w:spacing w:line="480" w:lineRule="auto"/>
+        <w:rPr>
+          <w:rFonts w:ascii="Times New Roman" w:hAnsi="Times New Roman" w:cs="Times New Roman"/>
+        </w:rPr>
+      </w:pPr>
+    </w:p>
+    <w:p>
+      <w:pPr>
+        <w:spacing w:line="480" w:lineRule="auto"/>
+        <w:rPr>
+          <w:rFonts w:ascii="Times New Roman" w:hAnsi="Times New Roman" w:cs="Times New Roman"/>
+        </w:rPr>
+      </w:pPr>
+      <w:r>
+        <w:rPr>
+          <w:rFonts w:ascii="Times New Roman" w:hAnsi="Times New Roman" w:cs="Times New Roman"/>
+        </w:rPr>
+        <w:lastRenderedPageBreak/>
+        <w:t>6. Assignment Submission Page</w:t>
+      </w:r>
+    </w:p>
+    <w:p>
+      <w:pPr>
+        <w:spacing w:line="480" w:lineRule="auto"/>
+        <w:rPr>
+          <w:rFonts w:ascii="Times New Roman" w:hAnsi="Times New Roman" w:cs="Times New Roman"/>
+        </w:rPr>
+      </w:pPr>
+      <w:r>
+        <w:rPr>
+          <w:rFonts w:ascii="Times New Roman" w:hAnsi="Times New Roman" w:cs="Times New Roman"/>
+        </w:rPr>
+        <w:t>Goal: Submit text or file for review</w:t>
+      </w:r>
+    </w:p>
+    <w:p>
+      <w:pPr>
+        <w:spacing w:line="480" w:lineRule="auto"/>
+        <w:rPr>
+          <w:rFonts w:ascii="Times New Roman" w:hAnsi="Times New Roman" w:cs="Times New Roman"/>
+        </w:rPr>
+      </w:pPr>
+      <w:r>
+        <w:rPr>
+          <w:rFonts w:ascii="Times New Roman" w:hAnsi="Times New Roman" w:cs="Times New Roman"/>
+        </w:rPr>
+        <w:t>Components:</w:t>
+      </w:r>
+    </w:p>
+    <w:p>
+      <w:pPr>
+        <w:spacing w:line="480" w:lineRule="auto"/>
+        <w:rPr>
+          <w:rFonts w:ascii="Times New Roman" w:hAnsi="Times New Roman" w:cs="Times New Roman"/>
+        </w:rPr>
+      </w:pPr>
+      <w:r>
+        <w:rPr>
+          <w:rFonts w:ascii="Times New Roman" w:hAnsi="Times New Roman" w:cs="Times New Roman"/>
+        </w:rPr>
+        <w:t>· Assignment title + instructions</w:t>
+      </w:r>
+    </w:p>
+    <w:p>
+      <w:pPr>
+        <w:spacing w:line="480" w:lineRule="auto"/>
+        <w:rPr>
+          <w:rFonts w:ascii="Times New Roman" w:hAnsi="Times New Roman" w:cs="Times New Roman"/>
+        </w:rPr>
+      </w:pPr>
+      <w:r>
+        <w:rPr>
+          <w:rFonts w:ascii="Times New Roman" w:hAnsi="Times New Roman" w:cs="Times New Roman"/>
+        </w:rPr>
+        <w:t>· Due date badge</w:t>
+      </w:r>
+    </w:p>
+    <w:p>
+      <w:pPr>
+        <w:spacing w:line="480" w:lineRule="auto"/>
+        <w:rPr>
+          <w:rFonts w:ascii="Times New Roman" w:hAnsi="Times New Roman" w:cs="Times New Roman"/>
+        </w:rPr>
+      </w:pPr>
+      <w:r>
+        <w:rPr>
+          <w:rFonts w:ascii="Times New Roman" w:hAnsi="Times New Roman" w:cs="Times New Roman"/>
+        </w:rPr>
+        <w:t>· File upload (or text area for written response)</w:t>
+      </w:r>
+    </w:p>
+    <w:p>
+      <w:pPr>
+        <w:spacing w:line="480" w:lineRule="auto"/>
+        <w:rPr>
+          <w:rFonts w:ascii="Times New Roman" w:hAnsi="Times New Roman" w:cs="Times New Roman"/>
+        </w:rPr>
+      </w:pPr>
+      <w:r>
+        <w:rPr>
+          <w:rFonts w:ascii="Times New Roman" w:hAnsi="Times New Roman" w:cs="Times New Roman"/>
+        </w:rPr>
+        <w:t>· Submit button</w:t>
+      </w:r>
+    </w:p>
+    <w:p>
+      <w:pPr>
+        <w:spacing w:line="480" w:lineRule="auto"/>
+        <w:rPr>
+          <w:rFonts w:ascii="Times New Roman" w:hAnsi="Times New Roman" w:cs="Times New Roman"/>
+        </w:rPr>
+      </w:pPr>
+      <w:r>
+        <w:rPr>
+          <w:rFonts w:ascii="Times New Roman" w:hAnsi="Times New Roman" w:cs="Times New Roman"/>
+        </w:rPr>
+        <w:t>· Submission status (draft / submitted / graded)</w:t>
+      </w:r>
+    </w:p>
+    <w:p>
+      <w:pPr>
+        <w:spacing w:line="480" w:lineRule="auto"/>
+        <w:rPr>
+          <w:rFonts w:ascii="Times New Roman" w:hAnsi="Times New Roman" w:cs="Times New Roman"/>
+        </w:rPr>
+      </w:pPr>
+      <w:r>
+        <w:rPr>
+          <w:rFonts w:ascii="Times New Roman" w:hAnsi="Times New Roman" w:cs="Times New Roman"/>
+        </w:rPr>
+        <w:t>7. Progress / Performance Page</w:t>
+      </w:r>
+    </w:p>
+    <w:p>
+      <w:pPr>
+        <w:spacing w:line="480" w:lineRule="auto"/>
+        <w:rPr>
+          <w:rFonts w:ascii="Times New Roman" w:hAnsi="Times New Roman" w:cs="Times New Roman"/>
+        </w:rPr>
+      </w:pPr>
+      <w:r>
+        <w:rPr>
+          <w:rFonts w:ascii="Times New Roman" w:hAnsi="Times New Roman" w:cs="Times New Roman"/>
+        </w:rPr>
+        <w:t>Goal: Visual tracking of learnin</w:t>
+      </w:r>
+      <w:r>
+        <w:rPr>
+          <w:rFonts w:ascii="Times New Roman" w:hAnsi="Times New Roman" w:cs="Times New Roman"/>
+        </w:rPr>
+        <w:t>g</w:t>
+      </w:r>
+    </w:p>
+    <w:p>
+      <w:pPr>
+        <w:spacing w:line="480" w:lineRule="auto"/>
+        <w:rPr>
+          <w:rFonts w:ascii="Times New Roman" w:hAnsi="Times New Roman" w:cs="Times New Roman"/>
+        </w:rPr>
+      </w:pPr>
+      <w:r>
+        <w:rPr>
+          <w:rFonts w:ascii="Times New Roman" w:hAnsi="Times New Roman" w:cs="Times New Roman"/>
+        </w:rPr>
+        <w:t>Components:</w:t>
+      </w:r>
+    </w:p>
+    <w:p>
+      <w:pPr>
+        <w:spacing w:line="480" w:lineRule="auto"/>
+        <w:rPr>
+          <w:rFonts w:ascii="Times New Roman" w:hAnsi="Times New Roman" w:cs="Times New Roman"/>
+        </w:rPr>
+      </w:pPr>
+      <w:r>
+        <w:rPr>
+          <w:rFonts w:ascii="Times New Roman" w:hAnsi="Times New Roman" w:cs="Times New Roman"/>
+        </w:rPr>
+        <w:t>· Overall completion % (large circle or bar)</w:t>
+      </w:r>
+    </w:p>
+    <w:p>
+      <w:pPr>
+        <w:spacing w:line="480" w:lineRule="auto"/>
+        <w:rPr>
+          <w:rFonts w:ascii="Times New Roman" w:hAnsi="Times New Roman" w:cs="Times New Roman"/>
+        </w:rPr>
+      </w:pPr>
+      <w:r>
+        <w:rPr>
+          <w:rFonts w:ascii="Times New Roman" w:hAnsi="Times New Roman" w:cs="Times New Roman"/>
+        </w:rPr>
+        <w:t>· Course-by-course progress cards</w:t>
+      </w:r>
+    </w:p>
+    <w:p>
+      <w:pPr>
+        <w:spacing w:line="480" w:lineRule="auto"/>
+        <w:rPr>
+          <w:rFonts w:ascii="Times New Roman" w:hAnsi="Times New Roman" w:cs="Times New Roman"/>
+        </w:rPr>
+      </w:pPr>
+      <w:r>
+        <w:rPr>
+          <w:rFonts w:ascii="Times New Roman" w:hAnsi="Times New Roman" w:cs="Times New Roman"/>
+        </w:rPr>
+        <w:t>· Chart (optional): weekly activity or quiz scores</w:t>
+      </w:r>
+    </w:p>
+    <w:p>
+      <w:pPr>
+        <w:spacing w:line="480" w:lineRule="auto"/>
+        <w:rPr>
+          <w:rFonts w:ascii="Times New Roman" w:hAnsi="Times New Roman" w:cs="Times New Roman"/>
+        </w:rPr>
+      </w:pPr>
+      <w:r>
+        <w:rPr>
+          <w:rFonts w:ascii="Times New Roman" w:hAnsi="Times New Roman" w:cs="Times New Roman"/>
+        </w:rPr>
+        <w:t>· Completed vs pending lessons list</w:t>
+      </w:r>
+    </w:p>
+    <w:p>
+      <w:pPr>
+        <w:spacing w:line="480" w:lineRule="auto"/>
+        <w:rPr>
+          <w:rFonts w:ascii="Times New Roman" w:hAnsi="Times New Roman" w:cs="Times New Roman"/>
+        </w:rPr>
+      </w:pPr>
+    </w:p>
+    <w:p>
+      <w:pPr>
+        <w:spacing w:line="480" w:lineRule="auto"/>
+        <w:rPr>
+          <w:rFonts w:ascii="Times New Roman" w:hAnsi="Times New Roman" w:cs="Times New Roman"/>
+        </w:rPr>
+      </w:pPr>
+    </w:p>
+    <w:p>
+      <w:pPr>
+        <w:spacing w:line="480" w:lineRule="auto"/>
+        <w:rPr>
+          <w:rFonts w:ascii="Times New Roman" w:hAnsi="Times New Roman" w:cs="Times New Roman"/>
+        </w:rPr>
+      </w:pPr>
+    </w:p>
+    <w:p>
+      <w:pPr>
+        <w:spacing w:line="480" w:lineRule="auto"/>
+        <w:rPr>
+          <w:rFonts w:ascii="Times New Roman" w:hAnsi="Times New Roman" w:cs="Times New Roman"/>
+        </w:rPr>
+      </w:pPr>
+      <w:r>
+        <w:rPr>
+          <w:rFonts w:ascii="Times New Roman" w:hAnsi="Times New Roman" w:cs="Times New Roman"/>
+        </w:rPr>
+        <w:lastRenderedPageBreak/>
+        <w:t>8. Profile / Settings Page</w:t>
+      </w:r>
+    </w:p>
+    <w:p>
+      <w:pPr>
+        <w:spacing w:line="480" w:lineRule="auto"/>
+        <w:rPr>
+          <w:rFonts w:ascii="Times New Roman" w:hAnsi="Times New Roman" w:cs="Times New Roman"/>
+        </w:rPr>
+      </w:pPr>
+      <w:r>
+        <w:rPr>
+          <w:rFonts w:ascii="Times New Roman" w:hAnsi="Times New Roman" w:cs="Times New Roman"/>
+        </w:rPr>
+        <w:t>Goal: Update learner info</w:t>
+      </w:r>
+    </w:p>
+    <w:p>
+      <w:pPr>
+        <w:spacing w:line="480" w:lineRule="auto"/>
+        <w:rPr>
+          <w:rFonts w:ascii="Times New Roman" w:hAnsi="Times New Roman" w:cs="Times New Roman"/>
+        </w:rPr>
+      </w:pPr>
+      <w:r>
+        <w:rPr>
+          <w:rFonts w:ascii="Times New Roman" w:hAnsi="Times New Roman" w:cs="Times New Roman"/>
+        </w:rPr>
+        <w:t>Components:</w:t>
+      </w:r>
+    </w:p>
+    <w:p>
+      <w:pPr>
+        <w:spacing w:line="480" w:lineRule="auto"/>
+        <w:rPr>
+          <w:rFonts w:ascii="Times New Roman" w:hAnsi="Times New Roman" w:cs="Times New Roman"/>
+        </w:rPr>
+      </w:pPr>
+      <w:r>
+        <w:rPr>
+          <w:rFonts w:ascii="Times New Roman" w:hAnsi="Times New Roman" w:cs="Times New Roman"/>
+        </w:rPr>
+        <w:t>· Avatar upload (placeholder)</w:t>
+      </w:r>
+    </w:p>
+    <w:p>
+      <w:pPr>
+        <w:spacing w:line="480" w:lineRule="auto"/>
+        <w:rPr>
+          <w:rFonts w:ascii="Times New Roman" w:hAnsi="Times New Roman" w:cs="Times New Roman"/>
+        </w:rPr>
+      </w:pPr>
+      <w:r>
+        <w:rPr>
+          <w:rFonts w:ascii="Times New Roman" w:hAnsi="Times New Roman" w:cs="Times New Roman"/>
+        </w:rPr>
+        <w:t>· Name + email fields</w:t>
+      </w:r>
+    </w:p>
+    <w:p>
+      <w:pPr>
+        <w:spacing w:line="480" w:lineRule="auto"/>
+        <w:rPr>
+          <w:rFonts w:ascii="Times New Roman" w:hAnsi="Times New Roman" w:cs="Times New Roman"/>
+        </w:rPr>
+      </w:pPr>
+      <w:r>
+        <w:rPr>
+          <w:rFonts w:ascii="Times New Roman" w:hAnsi="Times New Roman" w:cs="Times New Roman"/>
+        </w:rPr>
+        <w:t>· Password change (optional)</w:t>
+      </w:r>
+    </w:p>
+    <w:p>
+      <w:pPr>
+        <w:spacing w:line="480" w:lineRule="auto"/>
+        <w:rPr>
+          <w:rFonts w:ascii="Times New Roman" w:hAnsi="Times New Roman" w:cs="Times New Roman"/>
+        </w:rPr>
+      </w:pPr>
+      <w:r>
+        <w:rPr>
+          <w:rFonts w:ascii="Times New Roman" w:hAnsi="Times New Roman" w:cs="Times New Roman"/>
+        </w:rPr>
+        <w:t>· Notification preferences toggle</w:t>
+      </w:r>
+    </w:p>
+    <w:p>
+      <w:pPr>
+        <w:spacing w:line="480" w:lineRule="auto"/>
+        <w:rPr>
+          <w:rFonts w:ascii="Times New Roman" w:hAnsi="Times New Roman" w:cs="Times New Roman"/>
+        </w:rPr>
+      </w:pPr>
+      <w:r>
+        <w:rPr>
+          <w:rFonts w:ascii="Times New Roman" w:hAnsi="Times New Roman" w:cs="Times New Roman"/>
+        </w:rPr>
+        <w:t>DESIGN DECISIONS TO MENTION IN YOUR EXPLANATION</w:t>
+      </w:r>
+    </w:p>
+    <w:p>
+      <w:pPr>
+        <w:spacing w:line="480" w:lineRule="auto"/>
+        <w:rPr>
+          <w:rFonts w:ascii="Times New Roman" w:hAnsi="Times New Roman" w:cs="Times New Roman"/>
+        </w:rPr>
+      </w:pPr>
+      <w:r>
+        <w:rPr>
+          <w:rFonts w:ascii="Times New Roman" w:hAnsi="Times New Roman" w:cs="Times New Roman"/>
+        </w:rPr>
+        <w:t>1. Progressive disclosure – Dashboard shows summary, modules page shows details.</w:t>
+      </w:r>
+    </w:p>
+    <w:p>
+      <w:pPr>
+        <w:spacing w:line="480" w:lineRule="auto"/>
+        <w:rPr>
+          <w:rFonts w:ascii="Times New Roman" w:hAnsi="Times New Roman" w:cs="Times New Roman"/>
+        </w:rPr>
+      </w:pPr>
+      <w:r>
+        <w:rPr>
+          <w:rFonts w:ascii="Times New Roman" w:hAnsi="Times New Roman" w:cs="Times New Roman"/>
+        </w:rPr>
+        <w:t>2. Feedback loops – Green checkmarks, progress bars update after "Mark Complete".</w:t>
+      </w:r>
+    </w:p>
+    <w:p>
+      <w:pPr>
+        <w:spacing w:line="480" w:lineRule="auto"/>
+        <w:rPr>
+          <w:rFonts w:ascii="Times New Roman" w:hAnsi="Times New Roman" w:cs="Times New Roman"/>
+        </w:rPr>
+      </w:pPr>
+      <w:r>
+        <w:rPr>
+          <w:rFonts w:ascii="Times New Roman" w:hAnsi="Times New Roman" w:cs="Times New Roman"/>
+        </w:rPr>
+        <w:t>3. Mobile-first – Stacked cards, collapsible sidebar on small screens.</w:t>
+      </w:r>
+    </w:p>
+    <w:p>
+      <w:pPr>
+        <w:spacing w:line="480" w:lineRule="auto"/>
+        <w:rPr>
+          <w:rFonts w:ascii="Times New Roman" w:hAnsi="Times New Roman" w:cs="Times New Roman"/>
+        </w:rPr>
+      </w:pPr>
+      <w:r>
+        <w:rPr>
+          <w:rFonts w:ascii="Times New Roman" w:hAnsi="Times New Roman" w:cs="Times New Roman"/>
+        </w:rPr>
+        <w:t>4. Reduced cognitive load – Consistent color for success (green), one primary action per page.</w:t>
+      </w:r>
+    </w:p>
+    <w:p>
+      <w:pPr>
+        <w:spacing w:line="480" w:lineRule="auto"/>
+        <w:rPr>
+          <w:rFonts w:ascii="Times New Roman" w:hAnsi="Times New Roman" w:cs="Times New Roman"/>
+        </w:rPr>
+      </w:pPr>
+    </w:p>
     <w:sectPr>
       <w:pgSz w:w="12240" w:h="15840"/>
       <w:pgMar w:top="1440" w:right="1440" w:bottom="1440" w:left="1440" w:header="720" w:footer="720" w:gutter="0"/>
@@ -11,6 +1528,195 @@
     </w:sectPr>
   </w:body>
 </w:document>
+</file>
+
+<file path=word/numbering.xml><?xml version="1.0" encoding="utf-8"?>
+<w:numbering xmlns:wpc="http://schemas.microsoft.com/office/word/2010/wordprocessingCanvas" xmlns:cx="http://schemas.microsoft.com/office/drawing/2014/chartex" xmlns:cx1="http://schemas.microsoft.com/office/drawing/2015/9/8/chartex" xmlns:cx2="http://schemas.microsoft.com/office/drawing/2015/10/21/chartex" xmlns:cx3="http://schemas.microsoft.com/office/drawing/2016/5/9/chartex" xmlns:cx4="http://schemas.microsoft.com/office/drawing/2016/5/10/chartex" xmlns:cx5="http://schemas.microsoft.com/office/drawing/2016/5/11/chartex" xmlns:cx6="http://schemas.microsoft.com/office/drawing/2016/5/12/chartex" xmlns:cx7="http://schemas.microsoft.com/office/drawing/2016/5/13/chartex" xmlns:cx8="http://schemas.microsoft.com/office/drawing/2016/5/14/chartex" xmlns:mc="http://schemas.openxmlformats.org/markup-compatibility/2006" xmlns:aink="http://schemas.microsoft.com/office/drawing/2016/ink" xmlns:am3d="http://schemas.microsoft.com/office/drawing/2017/model3d" xmlns:o="urn:schemas-microsoft-com:office:office" xmlns:oel="http://schemas.microsoft.com/office/2019/extlst" xmlns:r="http://schemas.openxmlformats.org/officeDocument/2006/relationships" xmlns:m="http://schemas.openxmlformats.org/officeDocument/2006/math" xmlns:v="urn:schemas-microsoft-com:vml" xmlns:wp14="http://schemas.microsoft.com/office/word/2010/wordprocessingDrawing" xmlns:wp="http://schemas.openxmlformats.org/drawingml/2006/wordprocessingDrawing" xmlns:w10="urn:schemas-microsoft-com:office:word" xmlns:w="http://schemas.openxmlformats.org/wordprocessingml/2006/main" xmlns:w14="http://schemas.microsoft.com/office/word/2010/wordml" xmlns:w15="http://schemas.microsoft.com/office/word/2012/wordml" xmlns:w16cex="http://schemas.microsoft.com/office/word/2018/wordml/cex" xmlns:w16cid="http://schemas.microsoft.com/office/word/2016/wordml/cid" xmlns:w16="http://schemas.microsoft.com/office/word/2018/wordml" xmlns:w16du="http://schemas.microsoft.com/office/word/2023/wordml/word16du" xmlns:w16sdtdh="http://schemas.microsoft.com/office/word/2020/wordml/sdtdatahash" xmlns:w16sdtfl="http://schemas.microsoft.com/office/word/2024/wordml/sdtformatlock" xmlns:w16se="http://schemas.microsoft.com/office/word/2015/wordml/symex" xmlns:wpg="http://schemas.microsoft.com/office/word/2010/wordprocessingGroup" xmlns:wpi="http://schemas.microsoft.com/office/word/2010/wordprocessingInk" xmlns:wne="http://schemas.microsoft.com/office/word/2006/wordml" xmlns:wps="http://schemas.microsoft.com/office/word/2010/wordprocessingShape" mc:Ignorable="w14 w15 w16se w16cid w16 w16cex w16sdtdh w16sdtfl w16du wp14">
+  <w:abstractNum w:abstractNumId="0" w15:restartNumberingAfterBreak="0">
+    <w:nsid w:val="2D223A36"/>
+    <w:multiLevelType w:val="hybridMultilevel"/>
+    <w:tmpl w:val="F036F70A"/>
+    <w:lvl w:ilvl="0" w:tplc="0409000F">
+      <w:start w:val="1"/>
+      <w:numFmt w:val="decimal"/>
+      <w:lvlText w:val="%1."/>
+      <w:lvlJc w:val="left"/>
+      <w:pPr>
+        <w:ind w:left="720" w:hanging="360"/>
+      </w:pPr>
+      <w:rPr>
+        <w:rFonts w:hint="default"/>
+      </w:rPr>
+    </w:lvl>
+    <w:lvl w:ilvl="1" w:tplc="04090019" w:tentative="1">
+      <w:start w:val="1"/>
+      <w:numFmt w:val="lowerLetter"/>
+      <w:lvlText w:val="%2."/>
+      <w:lvlJc w:val="left"/>
+      <w:pPr>
+        <w:ind w:left="1440" w:hanging="360"/>
+      </w:pPr>
+    </w:lvl>
+    <w:lvl w:ilvl="2" w:tplc="0409001B" w:tentative="1">
+      <w:start w:val="1"/>
+      <w:numFmt w:val="lowerRoman"/>
+      <w:lvlText w:val="%3."/>
+      <w:lvlJc w:val="right"/>
+      <w:pPr>
+        <w:ind w:left="2160" w:hanging="180"/>
+      </w:pPr>
+    </w:lvl>
+    <w:lvl w:ilvl="3" w:tplc="0409000F" w:tentative="1">
+      <w:start w:val="1"/>
+      <w:numFmt w:val="decimal"/>
+      <w:lvlText w:val="%4."/>
+      <w:lvlJc w:val="left"/>
+      <w:pPr>
+        <w:ind w:left="2880" w:hanging="360"/>
+      </w:pPr>
+    </w:lvl>
+    <w:lvl w:ilvl="4" w:tplc="04090019" w:tentative="1">
+      <w:start w:val="1"/>
+      <w:numFmt w:val="lowerLetter"/>
+      <w:lvlText w:val="%5."/>
+      <w:lvlJc w:val="left"/>
+      <w:pPr>
+        <w:ind w:left="3600" w:hanging="360"/>
+      </w:pPr>
+    </w:lvl>
+    <w:lvl w:ilvl="5" w:tplc="0409001B" w:tentative="1">
+      <w:start w:val="1"/>
+      <w:numFmt w:val="lowerRoman"/>
+      <w:lvlText w:val="%6."/>
+      <w:lvlJc w:val="right"/>
+      <w:pPr>
+        <w:ind w:left="4320" w:hanging="180"/>
+      </w:pPr>
+    </w:lvl>
+    <w:lvl w:ilvl="6" w:tplc="0409000F" w:tentative="1">
+      <w:start w:val="1"/>
+      <w:numFmt w:val="decimal"/>
+      <w:lvlText w:val="%7."/>
+      <w:lvlJc w:val="left"/>
+      <w:pPr>
+        <w:ind w:left="5040" w:hanging="360"/>
+      </w:pPr>
+    </w:lvl>
+    <w:lvl w:ilvl="7" w:tplc="04090019" w:tentative="1">
+      <w:start w:val="1"/>
+      <w:numFmt w:val="lowerLetter"/>
+      <w:lvlText w:val="%8."/>
+      <w:lvlJc w:val="left"/>
+      <w:pPr>
+        <w:ind w:left="5760" w:hanging="360"/>
+      </w:pPr>
+    </w:lvl>
+    <w:lvl w:ilvl="8" w:tplc="0409001B" w:tentative="1">
+      <w:start w:val="1"/>
+      <w:numFmt w:val="lowerRoman"/>
+      <w:lvlText w:val="%9."/>
+      <w:lvlJc w:val="right"/>
+      <w:pPr>
+        <w:ind w:left="6480" w:hanging="180"/>
+      </w:pPr>
+    </w:lvl>
+  </w:abstractNum>
+  <w:abstractNum w:abstractNumId="1" w15:restartNumberingAfterBreak="0">
+    <w:nsid w:val="31DF719E"/>
+    <w:multiLevelType w:val="hybridMultilevel"/>
+    <w:tmpl w:val="EF6A7226"/>
+    <w:lvl w:ilvl="0" w:tplc="0409000F">
+      <w:start w:val="1"/>
+      <w:numFmt w:val="decimal"/>
+      <w:lvlText w:val="%1."/>
+      <w:lvlJc w:val="left"/>
+      <w:pPr>
+        <w:ind w:left="720" w:hanging="360"/>
+      </w:pPr>
+      <w:rPr>
+        <w:rFonts w:hint="default"/>
+      </w:rPr>
+    </w:lvl>
+    <w:lvl w:ilvl="1" w:tplc="04090019" w:tentative="1">
+      <w:start w:val="1"/>
+      <w:numFmt w:val="lowerLetter"/>
+      <w:lvlText w:val="%2."/>
+      <w:lvlJc w:val="left"/>
+      <w:pPr>
+        <w:ind w:left="1440" w:hanging="360"/>
+      </w:pPr>
+    </w:lvl>
+    <w:lvl w:ilvl="2" w:tplc="0409001B" w:tentative="1">
+      <w:start w:val="1"/>
+      <w:numFmt w:val="lowerRoman"/>
+      <w:lvlText w:val="%3."/>
+      <w:lvlJc w:val="right"/>
+      <w:pPr>
+        <w:ind w:left="2160" w:hanging="180"/>
+      </w:pPr>
+    </w:lvl>
+    <w:lvl w:ilvl="3" w:tplc="0409000F" w:tentative="1">
+      <w:start w:val="1"/>
+      <w:numFmt w:val="decimal"/>
+      <w:lvlText w:val="%4."/>
+      <w:lvlJc w:val="left"/>
+      <w:pPr>
+        <w:ind w:left="2880" w:hanging="360"/>
+      </w:pPr>
+    </w:lvl>
+    <w:lvl w:ilvl="4" w:tplc="04090019" w:tentative="1">
+      <w:start w:val="1"/>
+      <w:numFmt w:val="lowerLetter"/>
+      <w:lvlText w:val="%5."/>
+      <w:lvlJc w:val="left"/>
+      <w:pPr>
+        <w:ind w:left="3600" w:hanging="360"/>
+      </w:pPr>
+    </w:lvl>
+    <w:lvl w:ilvl="5" w:tplc="0409001B" w:tentative="1">
+      <w:start w:val="1"/>
+      <w:numFmt w:val="lowerRoman"/>
+      <w:lvlText w:val="%6."/>
+      <w:lvlJc w:val="right"/>
+      <w:pPr>
+        <w:ind w:left="4320" w:hanging="180"/>
+      </w:pPr>
+    </w:lvl>
+    <w:lvl w:ilvl="6" w:tplc="0409000F" w:tentative="1">
+      <w:start w:val="1"/>
+      <w:numFmt w:val="decimal"/>
+      <w:lvlText w:val="%7."/>
+      <w:lvlJc w:val="left"/>
+      <w:pPr>
+        <w:ind w:left="5040" w:hanging="360"/>
+      </w:pPr>
+    </w:lvl>
+    <w:lvl w:ilvl="7" w:tplc="04090019" w:tentative="1">
+      <w:start w:val="1"/>
+      <w:numFmt w:val="lowerLetter"/>
+      <w:lvlText w:val="%8."/>
+      <w:lvlJc w:val="left"/>
+      <w:pPr>
+        <w:ind w:left="5760" w:hanging="360"/>
+      </w:pPr>
+    </w:lvl>
+    <w:lvl w:ilvl="8" w:tplc="0409001B" w:tentative="1">
+      <w:start w:val="1"/>
+      <w:numFmt w:val="lowerRoman"/>
+      <w:lvlText w:val="%9."/>
+      <w:lvlJc w:val="right"/>
+      <w:pPr>
+        <w:ind w:left="6480" w:hanging="180"/>
+      </w:pPr>
+    </w:lvl>
+  </w:abstractNum>
+  <w:num w:numId="1" w16cid:durableId="529027690">
+    <w:abstractNumId w:val="1"/>
+  </w:num>
+  <w:num w:numId="2" w16cid:durableId="1084575151">
+    <w:abstractNumId w:val="0"/>
+  </w:num>
+</w:numbering>
 </file>
 
 <file path=word/styles.xml><?xml version="1.0" encoding="utf-8"?>

</xml_diff>

<commit_message>
Began building of the landing page
</commit_message>
<xml_diff>
--- a/LEARNSPACE LMS FRONTEND.docx
+++ b/LEARNSPACE LMS FRONTEND.docx
@@ -14,7 +14,19 @@
         <w:rPr>
           <w:rFonts w:ascii="Times New Roman" w:hAnsi="Times New Roman" w:cs="Times New Roman"/>
         </w:rPr>
-        <w:t xml:space="preserve">LEARNSPACE LMS FRONTEND </w:t>
+        <w:t>LEARNSPACE LMS</w:t>
+      </w:r>
+      <w:r>
+        <w:rPr>
+          <w:rFonts w:ascii="Times New Roman" w:hAnsi="Times New Roman" w:cs="Times New Roman"/>
+        </w:rPr>
+        <w:t xml:space="preserve"> (Learning Management System)</w:t>
+      </w:r>
+      <w:r>
+        <w:rPr>
+          <w:rFonts w:ascii="Times New Roman" w:hAnsi="Times New Roman" w:cs="Times New Roman"/>
+        </w:rPr>
+        <w:t xml:space="preserve"> FRONTEND </w:t>
       </w:r>
     </w:p>
     <w:p>

</xml_diff>